<commit_message>
Documentos: resultados dos testes em celular, HMAC no servidor e entrada mais rápida; docx regenerados
Co-Authored-By: Claude Sonnet 5.5 <noreply@anthropic.com>
</commit_message>
<xml_diff>
--- a/docs/REQUISITOS.docx
+++ b/docs/REQUISITOS.docx
@@ -5589,9 +5589,9 @@
       </w:tblPr>
       <w:tblGrid>
         <w:gridCol w:w="907"/>
-        <w:gridCol w:w="5734"/>
+        <w:gridCol w:w="5312"/>
         <w:gridCol w:w="907"/>
-        <w:gridCol w:w="2089"/>
+        <w:gridCol w:w="2512"/>
       </w:tblGrid>
       <w:tr>
         <w:trPr>
@@ -5619,7 +5619,7 @@
         </w:tc>
         <w:tc>
           <w:tcPr>
-            <w:tcW w:type="dxa" w:w="5734"/>
+            <w:tcW w:type="dxa" w:w="5312"/>
             <w:shd w:val="clear" w:color="auto" w:fill="1F4E9C"/>
           </w:tcPr>
           <w:p>
@@ -5657,7 +5657,7 @@
         </w:tc>
         <w:tc>
           <w:tcPr>
-            <w:tcW w:type="dxa" w:w="2089"/>
+            <w:tcW w:type="dxa" w:w="2512"/>
             <w:shd w:val="clear" w:color="auto" w:fill="1F4E9C"/>
           </w:tcPr>
           <w:p>
@@ -5697,7 +5697,7 @@
         </w:tc>
         <w:tc>
           <w:tcPr>
-            <w:tcW w:type="dxa" w:w="5734"/>
+            <w:tcW w:type="dxa" w:w="5312"/>
           </w:tcPr>
           <w:p>
             <w:pPr>
@@ -5742,7 +5742,7 @@
         </w:tc>
         <w:tc>
           <w:tcPr>
-            <w:tcW w:type="dxa" w:w="2089"/>
+            <w:tcW w:type="dxa" w:w="2512"/>
           </w:tcPr>
           <w:p>
             <w:pPr>
@@ -5781,7 +5781,7 @@
         </w:tc>
         <w:tc>
           <w:tcPr>
-            <w:tcW w:type="dxa" w:w="5734"/>
+            <w:tcW w:type="dxa" w:w="5312"/>
             <w:shd w:val="clear" w:color="auto" w:fill="F6F8FB"/>
           </w:tcPr>
           <w:p>
@@ -5841,7 +5841,7 @@
         </w:tc>
         <w:tc>
           <w:tcPr>
-            <w:tcW w:type="dxa" w:w="2089"/>
+            <w:tcW w:type="dxa" w:w="2512"/>
             <w:shd w:val="clear" w:color="auto" w:fill="F6F8FB"/>
           </w:tcPr>
           <w:p>
@@ -5880,7 +5880,7 @@
         </w:tc>
         <w:tc>
           <w:tcPr>
-            <w:tcW w:type="dxa" w:w="5734"/>
+            <w:tcW w:type="dxa" w:w="5312"/>
           </w:tcPr>
           <w:p>
             <w:pPr>
@@ -5925,7 +5925,7 @@
         </w:tc>
         <w:tc>
           <w:tcPr>
-            <w:tcW w:type="dxa" w:w="2089"/>
+            <w:tcW w:type="dxa" w:w="2512"/>
           </w:tcPr>
           <w:p>
             <w:pPr>
@@ -5964,7 +5964,7 @@
         </w:tc>
         <w:tc>
           <w:tcPr>
-            <w:tcW w:type="dxa" w:w="5734"/>
+            <w:tcW w:type="dxa" w:w="5312"/>
             <w:shd w:val="clear" w:color="auto" w:fill="F6F8FB"/>
           </w:tcPr>
           <w:p>
@@ -5998,7 +5998,7 @@
         </w:tc>
         <w:tc>
           <w:tcPr>
-            <w:tcW w:type="dxa" w:w="2089"/>
+            <w:tcW w:type="dxa" w:w="2512"/>
             <w:shd w:val="clear" w:color="auto" w:fill="F6F8FB"/>
           </w:tcPr>
           <w:p>
@@ -6037,7 +6037,7 @@
         </w:tc>
         <w:tc>
           <w:tcPr>
-            <w:tcW w:type="dxa" w:w="5734"/>
+            <w:tcW w:type="dxa" w:w="5312"/>
           </w:tcPr>
           <w:p>
             <w:pPr>
@@ -6082,7 +6082,7 @@
         </w:tc>
         <w:tc>
           <w:tcPr>
-            <w:tcW w:type="dxa" w:w="2089"/>
+            <w:tcW w:type="dxa" w:w="2512"/>
           </w:tcPr>
           <w:p>
             <w:pPr>
@@ -6093,13 +6093,13 @@
                 <w:rFonts w:ascii="Segoe UI Emoji" w:hAnsi="Segoe UI Emoji" w:cs="Segoe UI Emoji" w:eastAsia="Segoe UI Emoji"/>
                 <w:sz w:val="19"/>
               </w:rPr>
-              <w:t>🟡</w:t>
-            </w:r>
-            <w:r>
-              <w:rPr>
-                <w:sz w:val="19"/>
-              </w:rPr>
-              <w:t xml:space="preserve"> reconexão implementada; falta confirmar em aparelho real</w:t>
+              <w:t>✅</w:t>
+            </w:r>
+            <w:r>
+              <w:rPr>
+                <w:sz w:val="19"/>
+              </w:rPr>
+              <w:t xml:space="preserve"> testado em celular real: voltou sozinho, sem recarregar, com o texto e o arquivo novos</w:t>
             </w:r>
           </w:p>
         </w:tc>
@@ -7781,17 +7781,12 @@
                 <w:b/>
                 <w:sz w:val="19"/>
               </w:rPr>
-              <w:t>hash Argon2</w:t>
-            </w:r>
-            <w:r>
-              <w:rPr>
-                <w:sz w:val="19"/>
-              </w:rPr>
-              <w:t xml:space="preserve"> da </w:t>
+              <w:t xml:space="preserve">HMAC-SHA256 da </w:t>
             </w:r>
             <w:r>
               <w:rPr>
                 <w:rFonts w:ascii="Consolas" w:hAnsi="Consolas" w:cs="Consolas" w:eastAsia="Consolas"/>
+                <w:b/>
                 <w:color w:val="8A2A2A"/>
                 <w:sz w:val="17"/>
               </w:rPr>
@@ -7801,7 +7796,7 @@
               <w:rPr>
                 <w:sz w:val="19"/>
               </w:rPr>
-              <w:t>.</w:t>
+              <w:t>, calculado com a chave secreta do servidor (que não fica no banco): um banco roubado não serve nem para testar senhas.</w:t>
             </w:r>
           </w:p>
         </w:tc>
@@ -9205,9 +9200,9 @@
       </w:tblPr>
       <w:tblGrid>
         <w:gridCol w:w="1009"/>
-        <w:gridCol w:w="5259"/>
+        <w:gridCol w:w="4319"/>
         <w:gridCol w:w="907"/>
-        <w:gridCol w:w="2463"/>
+        <w:gridCol w:w="3402"/>
       </w:tblGrid>
       <w:tr>
         <w:trPr>
@@ -9235,7 +9230,7 @@
         </w:tc>
         <w:tc>
           <w:tcPr>
-            <w:tcW w:type="dxa" w:w="5259"/>
+            <w:tcW w:type="dxa" w:w="4319"/>
             <w:shd w:val="clear" w:color="auto" w:fill="1F4E9C"/>
           </w:tcPr>
           <w:p>
@@ -9273,7 +9268,7 @@
         </w:tc>
         <w:tc>
           <w:tcPr>
-            <w:tcW w:type="dxa" w:w="2463"/>
+            <w:tcW w:type="dxa" w:w="3402"/>
             <w:shd w:val="clear" w:color="auto" w:fill="1F4E9C"/>
           </w:tcPr>
           <w:p>
@@ -9313,30 +9308,37 @@
         </w:tc>
         <w:tc>
           <w:tcPr>
-            <w:tcW w:type="dxa" w:w="5259"/>
-          </w:tcPr>
-          <w:p>
-            <w:pPr>
-              <w:spacing w:after="0" w:line="252" w:lineRule="auto"/>
-            </w:pPr>
-            <w:r>
-              <w:rPr>
-                <w:sz w:val="19"/>
-              </w:rPr>
-              <w:t xml:space="preserve">Derivar as chaves a partir da senha leva </w:t>
-            </w:r>
+            <w:tcW w:type="dxa" w:w="4319"/>
+          </w:tcPr>
+          <w:p>
+            <w:pPr>
+              <w:spacing w:after="0" w:line="252" w:lineRule="auto"/>
+            </w:pPr>
             <w:r>
               <w:rPr>
                 <w:b/>
                 <w:sz w:val="19"/>
               </w:rPr>
-              <w:t>menos de ~1 segundo</w:t>
-            </w:r>
-            <w:r>
-              <w:rPr>
-                <w:sz w:val="19"/>
-              </w:rPr>
-              <w:t xml:space="preserve"> em um celular comum.</w:t>
+              <w:t>Entrar numa sala com senha</w:t>
+            </w:r>
+            <w:r>
+              <w:rPr>
+                <w:sz w:val="19"/>
+              </w:rPr>
+              <w:t xml:space="preserve"> (do toque em Entrar até a sala aparecer) leva </w:t>
+            </w:r>
+            <w:r>
+              <w:rPr>
+                <w:b/>
+                <w:sz w:val="19"/>
+              </w:rPr>
+              <w:t>no máximo ~3 segundos</w:t>
+            </w:r>
+            <w:r>
+              <w:rPr>
+                <w:sz w:val="19"/>
+              </w:rPr>
+              <w:t xml:space="preserve"> num celular comum, com internet móvel.</w:t>
             </w:r>
           </w:p>
         </w:tc>
@@ -9358,7 +9360,7 @@
         </w:tc>
         <w:tc>
           <w:tcPr>
-            <w:tcW w:type="dxa" w:w="2463"/>
+            <w:tcW w:type="dxa" w:w="3402"/>
           </w:tcPr>
           <w:p>
             <w:pPr>
@@ -9375,7 +9377,7 @@
               <w:rPr>
                 <w:sz w:val="19"/>
               </w:rPr>
-              <w:t xml:space="preserve"> medido só no computador; falta medir em celular</w:t>
+              <w:t xml:space="preserve"> medido ~4 s no celular antes das otimizações (a derivação em si leva ~0,1 s no computador); falta medir de novo</w:t>
             </w:r>
           </w:p>
         </w:tc>
@@ -9403,7 +9405,7 @@
         </w:tc>
         <w:tc>
           <w:tcPr>
-            <w:tcW w:type="dxa" w:w="5259"/>
+            <w:tcW w:type="dxa" w:w="4319"/>
             <w:shd w:val="clear" w:color="auto" w:fill="F6F8FB"/>
           </w:tcPr>
           <w:p>
@@ -9450,7 +9452,7 @@
         </w:tc>
         <w:tc>
           <w:tcPr>
-            <w:tcW w:type="dxa" w:w="2463"/>
+            <w:tcW w:type="dxa" w:w="3402"/>
             <w:shd w:val="clear" w:color="auto" w:fill="F6F8FB"/>
           </w:tcPr>
           <w:p>
@@ -9489,7 +9491,7 @@
         </w:tc>
         <w:tc>
           <w:tcPr>
-            <w:tcW w:type="dxa" w:w="5259"/>
+            <w:tcW w:type="dxa" w:w="4319"/>
           </w:tcPr>
           <w:p>
             <w:pPr>
@@ -9534,7 +9536,7 @@
         </w:tc>
         <w:tc>
           <w:tcPr>
-            <w:tcW w:type="dxa" w:w="2463"/>
+            <w:tcW w:type="dxa" w:w="3402"/>
           </w:tcPr>
           <w:p>
             <w:pPr>
@@ -9573,7 +9575,7 @@
         </w:tc>
         <w:tc>
           <w:tcPr>
-            <w:tcW w:type="dxa" w:w="5259"/>
+            <w:tcW w:type="dxa" w:w="4319"/>
             <w:shd w:val="clear" w:color="auto" w:fill="F6F8FB"/>
           </w:tcPr>
           <w:p>
@@ -9620,7 +9622,7 @@
         </w:tc>
         <w:tc>
           <w:tcPr>
-            <w:tcW w:type="dxa" w:w="2463"/>
+            <w:tcW w:type="dxa" w:w="3402"/>
             <w:shd w:val="clear" w:color="auto" w:fill="F6F8FB"/>
           </w:tcPr>
           <w:p>
@@ -9632,13 +9634,13 @@
                 <w:rFonts w:ascii="Segoe UI Emoji" w:hAnsi="Segoe UI Emoji" w:cs="Segoe UI Emoji" w:eastAsia="Segoe UI Emoji"/>
                 <w:sz w:val="19"/>
               </w:rPr>
-              <w:t>🟡</w:t>
-            </w:r>
-            <w:r>
-              <w:rPr>
-                <w:sz w:val="19"/>
-              </w:rPr>
-              <w:t xml:space="preserve"> testado 20 MB na internet e 100 MB localmente; falta 100 MB no 4G</w:t>
+              <w:t>✅</w:t>
+            </w:r>
+            <w:r>
+              <w:rPr>
+                <w:sz w:val="19"/>
+              </w:rPr>
+              <w:t xml:space="preserve"> testado em celular real: 1 min 36 s, e o arquivo baixou normalmente em outro aparelho</w:t>
             </w:r>
           </w:p>
         </w:tc>
@@ -11302,7 +11304,7 @@
               <w:rPr>
                 <w:sz w:val="19"/>
               </w:rPr>
-              <w:t>: 190 no backend e 72 no frontend, com formatação e análise estática (</w:t>
+              <w:t>: 195 no backend e 72 no frontend, com formatação e análise estática (</w:t>
             </w:r>
             <w:r>
               <w:rPr>
@@ -13851,8 +13853,8 @@
       </w:tblPr>
       <w:tblGrid>
         <w:gridCol w:w="907"/>
-        <w:gridCol w:w="4359"/>
-        <w:gridCol w:w="4372"/>
+        <w:gridCol w:w="4292"/>
+        <w:gridCol w:w="4439"/>
       </w:tblGrid>
       <w:tr>
         <w:trPr>
@@ -13880,7 +13882,7 @@
         </w:tc>
         <w:tc>
           <w:tcPr>
-            <w:tcW w:type="dxa" w:w="4359"/>
+            <w:tcW w:type="dxa" w:w="4292"/>
             <w:shd w:val="clear" w:color="auto" w:fill="1F4E9C"/>
           </w:tcPr>
           <w:p>
@@ -13899,7 +13901,7 @@
         </w:tc>
         <w:tc>
           <w:tcPr>
-            <w:tcW w:type="dxa" w:w="4372"/>
+            <w:tcW w:type="dxa" w:w="4439"/>
             <w:shd w:val="clear" w:color="auto" w:fill="1F4E9C"/>
           </w:tcPr>
           <w:p>
@@ -13939,7 +13941,7 @@
         </w:tc>
         <w:tc>
           <w:tcPr>
-            <w:tcW w:type="dxa" w:w="4359"/>
+            <w:tcW w:type="dxa" w:w="4292"/>
           </w:tcPr>
           <w:p>
             <w:pPr>
@@ -13955,7 +13957,7 @@
         </w:tc>
         <w:tc>
           <w:tcPr>
-            <w:tcW w:type="dxa" w:w="4372"/>
+            <w:tcW w:type="dxa" w:w="4439"/>
           </w:tcPr>
           <w:p>
             <w:pPr>
@@ -13993,7 +13995,7 @@
         </w:tc>
         <w:tc>
           <w:tcPr>
-            <w:tcW w:type="dxa" w:w="4359"/>
+            <w:tcW w:type="dxa" w:w="4292"/>
             <w:shd w:val="clear" w:color="auto" w:fill="F6F8FB"/>
           </w:tcPr>
           <w:p>
@@ -14010,7 +14012,7 @@
         </w:tc>
         <w:tc>
           <w:tcPr>
-            <w:tcW w:type="dxa" w:w="4372"/>
+            <w:tcW w:type="dxa" w:w="4439"/>
             <w:shd w:val="clear" w:color="auto" w:fill="F6F8FB"/>
           </w:tcPr>
           <w:p>
@@ -14048,7 +14050,7 @@
         </w:tc>
         <w:tc>
           <w:tcPr>
-            <w:tcW w:type="dxa" w:w="4359"/>
+            <w:tcW w:type="dxa" w:w="4292"/>
           </w:tcPr>
           <w:p>
             <w:pPr>
@@ -14064,7 +14066,7 @@
         </w:tc>
         <w:tc>
           <w:tcPr>
-            <w:tcW w:type="dxa" w:w="4372"/>
+            <w:tcW w:type="dxa" w:w="4439"/>
           </w:tcPr>
           <w:p>
             <w:pPr>
@@ -14102,7 +14104,7 @@
         </w:tc>
         <w:tc>
           <w:tcPr>
-            <w:tcW w:type="dxa" w:w="4359"/>
+            <w:tcW w:type="dxa" w:w="4292"/>
             <w:shd w:val="clear" w:color="auto" w:fill="F6F8FB"/>
           </w:tcPr>
           <w:p>
@@ -14119,7 +14121,7 @@
         </w:tc>
         <w:tc>
           <w:tcPr>
-            <w:tcW w:type="dxa" w:w="4372"/>
+            <w:tcW w:type="dxa" w:w="4439"/>
             <w:shd w:val="clear" w:color="auto" w:fill="F6F8FB"/>
           </w:tcPr>
           <w:p>
@@ -14157,7 +14159,7 @@
         </w:tc>
         <w:tc>
           <w:tcPr>
-            <w:tcW w:type="dxa" w:w="4359"/>
+            <w:tcW w:type="dxa" w:w="4292"/>
           </w:tcPr>
           <w:p>
             <w:pPr>
@@ -14173,7 +14175,7 @@
         </w:tc>
         <w:tc>
           <w:tcPr>
-            <w:tcW w:type="dxa" w:w="4372"/>
+            <w:tcW w:type="dxa" w:w="4439"/>
           </w:tcPr>
           <w:p>
             <w:pPr>
@@ -14211,7 +14213,7 @@
         </w:tc>
         <w:tc>
           <w:tcPr>
-            <w:tcW w:type="dxa" w:w="4359"/>
+            <w:tcW w:type="dxa" w:w="4292"/>
             <w:shd w:val="clear" w:color="auto" w:fill="F6F8FB"/>
           </w:tcPr>
           <w:p>
@@ -14228,7 +14230,7 @@
         </w:tc>
         <w:tc>
           <w:tcPr>
-            <w:tcW w:type="dxa" w:w="4372"/>
+            <w:tcW w:type="dxa" w:w="4439"/>
             <w:shd w:val="clear" w:color="auto" w:fill="F6F8FB"/>
           </w:tcPr>
           <w:p>
@@ -14266,7 +14268,7 @@
         </w:tc>
         <w:tc>
           <w:tcPr>
-            <w:tcW w:type="dxa" w:w="4359"/>
+            <w:tcW w:type="dxa" w:w="4292"/>
           </w:tcPr>
           <w:p>
             <w:pPr>
@@ -14282,7 +14284,7 @@
         </w:tc>
         <w:tc>
           <w:tcPr>
-            <w:tcW w:type="dxa" w:w="4372"/>
+            <w:tcW w:type="dxa" w:w="4439"/>
           </w:tcPr>
           <w:p>
             <w:pPr>
@@ -14320,7 +14322,7 @@
         </w:tc>
         <w:tc>
           <w:tcPr>
-            <w:tcW w:type="dxa" w:w="4359"/>
+            <w:tcW w:type="dxa" w:w="4292"/>
             <w:shd w:val="clear" w:color="auto" w:fill="F6F8FB"/>
           </w:tcPr>
           <w:p>
@@ -14337,7 +14339,7 @@
         </w:tc>
         <w:tc>
           <w:tcPr>
-            <w:tcW w:type="dxa" w:w="4372"/>
+            <w:tcW w:type="dxa" w:w="4439"/>
             <w:shd w:val="clear" w:color="auto" w:fill="F6F8FB"/>
           </w:tcPr>
           <w:p>
@@ -14383,7 +14385,7 @@
         </w:tc>
         <w:tc>
           <w:tcPr>
-            <w:tcW w:type="dxa" w:w="4359"/>
+            <w:tcW w:type="dxa" w:w="4292"/>
           </w:tcPr>
           <w:p>
             <w:pPr>
@@ -14399,7 +14401,7 @@
         </w:tc>
         <w:tc>
           <w:tcPr>
-            <w:tcW w:type="dxa" w:w="4372"/>
+            <w:tcW w:type="dxa" w:w="4439"/>
           </w:tcPr>
           <w:p>
             <w:pPr>
@@ -14437,7 +14439,7 @@
         </w:tc>
         <w:tc>
           <w:tcPr>
-            <w:tcW w:type="dxa" w:w="4359"/>
+            <w:tcW w:type="dxa" w:w="4292"/>
             <w:shd w:val="clear" w:color="auto" w:fill="F6F8FB"/>
           </w:tcPr>
           <w:p>
@@ -14454,7 +14456,7 @@
         </w:tc>
         <w:tc>
           <w:tcPr>
-            <w:tcW w:type="dxa" w:w="4372"/>
+            <w:tcW w:type="dxa" w:w="4439"/>
             <w:shd w:val="clear" w:color="auto" w:fill="F6F8FB"/>
           </w:tcPr>
           <w:p>
@@ -14492,7 +14494,7 @@
         </w:tc>
         <w:tc>
           <w:tcPr>
-            <w:tcW w:type="dxa" w:w="4359"/>
+            <w:tcW w:type="dxa" w:w="4292"/>
           </w:tcPr>
           <w:p>
             <w:pPr>
@@ -14508,7 +14510,7 @@
         </w:tc>
         <w:tc>
           <w:tcPr>
-            <w:tcW w:type="dxa" w:w="4372"/>
+            <w:tcW w:type="dxa" w:w="4439"/>
           </w:tcPr>
           <w:p>
             <w:pPr>
@@ -14546,7 +14548,7 @@
         </w:tc>
         <w:tc>
           <w:tcPr>
-            <w:tcW w:type="dxa" w:w="4359"/>
+            <w:tcW w:type="dxa" w:w="4292"/>
             <w:shd w:val="clear" w:color="auto" w:fill="F6F8FB"/>
           </w:tcPr>
           <w:p>
@@ -14563,7 +14565,7 @@
         </w:tc>
         <w:tc>
           <w:tcPr>
-            <w:tcW w:type="dxa" w:w="4372"/>
+            <w:tcW w:type="dxa" w:w="4439"/>
             <w:shd w:val="clear" w:color="auto" w:fill="F6F8FB"/>
           </w:tcPr>
           <w:p>
@@ -14572,16 +14574,9 @@
             </w:pPr>
             <w:r>
               <w:rPr>
-                <w:b/>
-                <w:sz w:val="19"/>
-              </w:rPr>
-              <w:t>Pendente</w:t>
-            </w:r>
-            <w:r>
-              <w:rPr>
-                <w:sz w:val="19"/>
-              </w:rPr>
-              <w:t>: 100 MB no 4G ainda não foi confirmado</w:t>
+                <w:sz w:val="19"/>
+              </w:rPr>
+              <w:t>Aceito: 100 MB no 4G em 1 min 36 s, baixado normalmente</w:t>
             </w:r>
           </w:p>
         </w:tc>
@@ -14608,7 +14603,7 @@
         </w:tc>
         <w:tc>
           <w:tcPr>
-            <w:tcW w:type="dxa" w:w="4359"/>
+            <w:tcW w:type="dxa" w:w="4292"/>
           </w:tcPr>
           <w:p>
             <w:pPr>
@@ -14624,24 +14619,17 @@
         </w:tc>
         <w:tc>
           <w:tcPr>
-            <w:tcW w:type="dxa" w:w="4372"/>
-          </w:tcPr>
-          <w:p>
-            <w:pPr>
-              <w:spacing w:after="0" w:line="252" w:lineRule="auto"/>
-            </w:pPr>
-            <w:r>
-              <w:rPr>
-                <w:b/>
-                <w:sz w:val="19"/>
-              </w:rPr>
-              <w:t>Pendente</w:t>
-            </w:r>
-            <w:r>
-              <w:rPr>
-                <w:sz w:val="19"/>
-              </w:rPr>
-              <w:t>: reconecta e atualiza</w:t>
+            <w:tcW w:type="dxa" w:w="4439"/>
+          </w:tcPr>
+          <w:p>
+            <w:pPr>
+              <w:spacing w:after="0" w:line="252" w:lineRule="auto"/>
+            </w:pPr>
+            <w:r>
+              <w:rPr>
+                <w:sz w:val="19"/>
+              </w:rPr>
+              <w:t>Aceito: reconecta sozinho e atualiza texto e arquivos</w:t>
             </w:r>
           </w:p>
         </w:tc>
@@ -17048,27 +17036,7 @@
       </w:pPr>
       <w:r>
         <w:rPr/>
-        <w:t>Tempo da derivação Argon2id em celular real (meta: menos de ~1 s) (RNF-020).</w:t>
-      </w:r>
-    </w:p>
-    <w:p>
-      <w:pPr>
-        <w:pStyle w:val="ListBullet"/>
-        <w:spacing w:after="60"/>
-      </w:pPr>
-      <w:r>
-        <w:rPr/>
-        <w:t>Envio de 100 MB na internet móvel (RNF-023, CA-12).</w:t>
-      </w:r>
-    </w:p>
-    <w:p>
-      <w:pPr>
-        <w:pStyle w:val="ListBullet"/>
-        <w:spacing w:after="60"/>
-      </w:pPr>
-      <w:r>
-        <w:rPr/>
-        <w:t>Reconexão com a tela do celular apagada (RF-054, CA-13).</w:t>
+        <w:t>Tempo de entrada com senha no celular depois das otimizações de carregamento (RNF-020): medido ~4 s antes; a meta é ~3 s.</w:t>
       </w:r>
     </w:p>
     <w:p>

</xml_diff>

<commit_message>
Entrada com senha no celular medida em 2,08 s; documentos atualizados
Co-Authored-By: Claude Sonnet 5.5 <noreply@anthropic.com>
</commit_message>
<xml_diff>
--- a/docs/REQUISITOS.docx
+++ b/docs/REQUISITOS.docx
@@ -9200,9 +9200,9 @@
       </w:tblPr>
       <w:tblGrid>
         <w:gridCol w:w="1009"/>
-        <w:gridCol w:w="4319"/>
+        <w:gridCol w:w="4663"/>
         <w:gridCol w:w="907"/>
-        <w:gridCol w:w="3402"/>
+        <w:gridCol w:w="3058"/>
       </w:tblGrid>
       <w:tr>
         <w:trPr>
@@ -9230,7 +9230,7 @@
         </w:tc>
         <w:tc>
           <w:tcPr>
-            <w:tcW w:type="dxa" w:w="4319"/>
+            <w:tcW w:type="dxa" w:w="4663"/>
             <w:shd w:val="clear" w:color="auto" w:fill="1F4E9C"/>
           </w:tcPr>
           <w:p>
@@ -9268,7 +9268,7 @@
         </w:tc>
         <w:tc>
           <w:tcPr>
-            <w:tcW w:type="dxa" w:w="3402"/>
+            <w:tcW w:type="dxa" w:w="3058"/>
             <w:shd w:val="clear" w:color="auto" w:fill="1F4E9C"/>
           </w:tcPr>
           <w:p>
@@ -9308,7 +9308,7 @@
         </w:tc>
         <w:tc>
           <w:tcPr>
-            <w:tcW w:type="dxa" w:w="4319"/>
+            <w:tcW w:type="dxa" w:w="4663"/>
           </w:tcPr>
           <w:p>
             <w:pPr>
@@ -9360,7 +9360,7 @@
         </w:tc>
         <w:tc>
           <w:tcPr>
-            <w:tcW w:type="dxa" w:w="3402"/>
+            <w:tcW w:type="dxa" w:w="3058"/>
           </w:tcPr>
           <w:p>
             <w:pPr>
@@ -9371,13 +9371,13 @@
                 <w:rFonts w:ascii="Segoe UI Emoji" w:hAnsi="Segoe UI Emoji" w:cs="Segoe UI Emoji" w:eastAsia="Segoe UI Emoji"/>
                 <w:sz w:val="19"/>
               </w:rPr>
-              <w:t>🟡</w:t>
-            </w:r>
-            <w:r>
-              <w:rPr>
-                <w:sz w:val="19"/>
-              </w:rPr>
-              <w:t xml:space="preserve"> medido ~4 s no celular antes das otimizações (a derivação em si leva ~0,1 s no computador); falta medir de novo</w:t>
+              <w:t>✅</w:t>
+            </w:r>
+            <w:r>
+              <w:rPr>
+                <w:sz w:val="19"/>
+              </w:rPr>
+              <w:t xml:space="preserve"> testado em celular real em 4G: 2,08 s (eram ~4 s antes das otimizações de carregamento)</w:t>
             </w:r>
           </w:p>
         </w:tc>
@@ -9405,7 +9405,7 @@
         </w:tc>
         <w:tc>
           <w:tcPr>
-            <w:tcW w:type="dxa" w:w="4319"/>
+            <w:tcW w:type="dxa" w:w="4663"/>
             <w:shd w:val="clear" w:color="auto" w:fill="F6F8FB"/>
           </w:tcPr>
           <w:p>
@@ -9452,7 +9452,7 @@
         </w:tc>
         <w:tc>
           <w:tcPr>
-            <w:tcW w:type="dxa" w:w="3402"/>
+            <w:tcW w:type="dxa" w:w="3058"/>
             <w:shd w:val="clear" w:color="auto" w:fill="F6F8FB"/>
           </w:tcPr>
           <w:p>
@@ -9491,7 +9491,7 @@
         </w:tc>
         <w:tc>
           <w:tcPr>
-            <w:tcW w:type="dxa" w:w="4319"/>
+            <w:tcW w:type="dxa" w:w="4663"/>
           </w:tcPr>
           <w:p>
             <w:pPr>
@@ -9536,7 +9536,7 @@
         </w:tc>
         <w:tc>
           <w:tcPr>
-            <w:tcW w:type="dxa" w:w="3402"/>
+            <w:tcW w:type="dxa" w:w="3058"/>
           </w:tcPr>
           <w:p>
             <w:pPr>
@@ -9575,7 +9575,7 @@
         </w:tc>
         <w:tc>
           <w:tcPr>
-            <w:tcW w:type="dxa" w:w="4319"/>
+            <w:tcW w:type="dxa" w:w="4663"/>
             <w:shd w:val="clear" w:color="auto" w:fill="F6F8FB"/>
           </w:tcPr>
           <w:p>
@@ -9622,7 +9622,7 @@
         </w:tc>
         <w:tc>
           <w:tcPr>
-            <w:tcW w:type="dxa" w:w="3402"/>
+            <w:tcW w:type="dxa" w:w="3058"/>
             <w:shd w:val="clear" w:color="auto" w:fill="F6F8FB"/>
           </w:tcPr>
           <w:p>
@@ -17027,16 +17027,6 @@
       <w:r>
         <w:rPr/>
         <w:t>10.1 Pendentes de validação</w:t>
-      </w:r>
-    </w:p>
-    <w:p>
-      <w:pPr>
-        <w:pStyle w:val="ListBullet"/>
-        <w:spacing w:after="60"/>
-      </w:pPr>
-      <w:r>
-        <w:rPr/>
-        <w:t>Tempo de entrada com senha no celular depois das otimizações de carregamento (RNF-020): medido ~4 s antes; a meta é ~3 s.</w:t>
       </w:r>
     </w:p>
     <w:p>

</xml_diff>

<commit_message>
Botão de tema claro/escuro no topo, capturas e documentos atualizados para o novo visual, teste de presença estável
Co-Authored-By: Claude Sonnet 5.5 <noreply@anthropic.com>
</commit_message>
<xml_diff>
--- a/docs/REQUISITOS.docx
+++ b/docs/REQUISITOS.docx
@@ -6352,7 +6352,20 @@
               <w:rPr>
                 <w:sz w:val="19"/>
               </w:rPr>
-              <w:t xml:space="preserve"> conforme o sistema do aparelho.</w:t>
+              <w:t xml:space="preserve">: segue o sistema do aparelho e há um </w:t>
+            </w:r>
+            <w:r>
+              <w:rPr>
+                <w:b/>
+                <w:sz w:val="19"/>
+              </w:rPr>
+              <w:t>botão discreto no topo</w:t>
+            </w:r>
+            <w:r>
+              <w:rPr>
+                <w:sz w:val="19"/>
+              </w:rPr>
+              <w:t xml:space="preserve"> para trocar; a escolha é lembrada neste navegador.</w:t>
             </w:r>
           </w:p>
         </w:tc>
@@ -6686,7 +6699,7 @@
               <w:rPr>
                 <w:sz w:val="19"/>
               </w:rPr>
-              <w:t>Diagrama visual do caminho da transferência ("linhas de metrô") nas telas inicial e da sala.</w:t>
+              <w:t>Diagrama visual do caminho da transferência (origem, sala e destino) nas telas inicial e da sala.</w:t>
             </w:r>
           </w:p>
         </w:tc>
@@ -11304,7 +11317,7 @@
               <w:rPr>
                 <w:sz w:val="19"/>
               </w:rPr>
-              <w:t>: 195 no backend e 72 no frontend, com formatação e análise estática (</w:t>
+              <w:t>: 198 no backend e 74 no frontend, com formatação e análise estática (</w:t>
             </w:r>
             <w:r>
               <w:rPr>

</xml_diff>

<commit_message>
Sobre vira ícone no topo (junto de idioma e tema), sem rodapé; topo ajustado para celulares estreitos; teste de presença estável
Co-Authored-By: Claude Sonnet 5.5 <noreply@anthropic.com>
</commit_message>
<xml_diff>
--- a/docs/REQUISITOS.docx
+++ b/docs/REQUISITOS.docx
@@ -6627,7 +6627,20 @@
               <w:rPr>
                 <w:sz w:val="19"/>
               </w:rPr>
-              <w:t xml:space="preserve"> com o que o servidor guarda, por quanto tempo e como denunciar abuso (contato configurável).</w:t>
+              <w:t xml:space="preserve"> com o que o servidor guarda, por quanto tempo e como denunciar abuso (contato configurável), acessível por um </w:t>
+            </w:r>
+            <w:r>
+              <w:rPr>
+                <w:b/>
+                <w:sz w:val="19"/>
+              </w:rPr>
+              <w:t>ícone ⓘ no topo</w:t>
+            </w:r>
+            <w:r>
+              <w:rPr>
+                <w:sz w:val="19"/>
+              </w:rPr>
+              <w:t xml:space="preserve"> de todas as páginas, junto do idioma e do tema.</w:t>
             </w:r>
           </w:p>
         </w:tc>
@@ -11317,7 +11330,7 @@
               <w:rPr>
                 <w:sz w:val="19"/>
               </w:rPr>
-              <w:t>: 198 no backend e 74 no frontend, com formatação e análise estática (</w:t>
+              <w:t>: 200 no backend e 74 no frontend, com formatação e análise estática (</w:t>
             </w:r>
             <w:r>
               <w:rPr>

</xml_diff>